<commit_message>
Add live dashboard screenshots to Results and Evaluation section
Two figures inserted after the results narrative, before Section 9:
- Figure 2: summary counters + session-freeze status
- Figure 3: action feed with denied rows highlighted, approved rows
  shown for comparison

Captured directly from the running Streamlit dashboard via headless
Chrome (CDP) against live DynamoDB data, not staged.

Co-Authored-By: Claude Sonnet 5 <noreply@anthropic.com>
</commit_message>
<xml_diff>
--- a/AgentShield_Project_Report.docx
+++ b/AgentShield_Project_Report.docx
@@ -2437,6 +2437,132 @@
           <w:szCs w:val="22"/>
         </w:rPr>
         <w:t xml:space="preserve">Alert delivery was not 100% on the first attempt: of the first four denied categories tested, only two (scope_deviation, persistence) produced a delivered email; the other two (unauthorized_network_call, privilege_escalation) failed silently at the SNS API call itself, discovered only by inspecting CloudWatch logs (see Section 9.1). After the underlying bug was fixed, both previously failing categories were re-tested in isolation and confirmed delivered, bringing alert delivery to 4 of 4 categories confirmed.</w:t>
+      </w:r>
+    </w:p>
+    <w:p>
+      <w:pPr>
+        <w:jc w:val="center"/>
+        <w:spacing w:before="120" w:after="60"/>
+      </w:pPr>
+      <w:r>
+        <w:drawing>
+          <wp:inline distT="0" distB="0" distL="0" distR="0">
+            <wp:extent cx="5760720" cy="3065526"/>
+            <wp:effectExtent t="0" r="0" b="0" l="0"/>
+            <wp:docPr id="2" name="" descr="" title=""/>
+            <wp:cNvGraphicFramePr>
+              <a:graphicFrameLocks xmlns:a="http://schemas.openxmlformats.org/drawingml/2006/main" noChangeAspect="1"/>
+            </wp:cNvGraphicFramePr>
+            <a:graphic xmlns:a="http://schemas.openxmlformats.org/drawingml/2006/main">
+              <a:graphicData uri="http://schemas.openxmlformats.org/drawingml/2006/picture">
+                <pic:pic xmlns:pic="http://schemas.openxmlformats.org/drawingml/2006/picture">
+                  <pic:nvPicPr>
+                    <pic:cNvPr id="0" name="" descr=""/>
+                    <pic:cNvPicPr>
+                      <a:picLocks noChangeAspect="1" noChangeArrowheads="1"/>
+                    </pic:cNvPicPr>
+                  </pic:nvPicPr>
+                  <pic:blipFill>
+                    <a:blip r:embed="rId11" cstate="none"/>
+                    <a:srcRect/>
+                    <a:stretch>
+                      <a:fillRect/>
+                    </a:stretch>
+                  </pic:blipFill>
+                  <pic:spPr bwMode="auto">
+                    <a:xfrm>
+                      <a:off x="0" y="0"/>
+                      <a:ext cx="5760720" cy="3065526"/>
+                    </a:xfrm>
+                    <a:prstGeom prst="rect">
+                      <a:avLst/>
+                    </a:prstGeom>
+                  </pic:spPr>
+                </pic:pic>
+              </a:graphicData>
+            </a:graphic>
+          </wp:inline>
+        </w:drawing>
+      </w:r>
+    </w:p>
+    <w:p>
+      <w:pPr>
+        <w:jc w:val="center"/>
+        <w:spacing w:after="200"/>
+      </w:pPr>
+      <w:r>
+        <w:rPr>
+          <w:rFonts w:ascii="Calibri" w:cs="Calibri" w:eastAsia="Calibri" w:hAnsi="Calibri"/>
+          <w:i/>
+          <w:iCs/>
+          <w:sz w:val="20"/>
+          <w:szCs w:val="20"/>
+          <w:color w:val="595959"/>
+        </w:rPr>
+        <w:t xml:space="preserve">Figure 2. AgentShield dashboard — summary counters and session-freeze status, reading AgentShieldLogs / AgentShieldSessions live from DynamoDB.</w:t>
+      </w:r>
+    </w:p>
+    <w:p>
+      <w:pPr>
+        <w:jc w:val="center"/>
+        <w:spacing w:before="120" w:after="60"/>
+      </w:pPr>
+      <w:r>
+        <w:drawing>
+          <wp:inline distT="0" distB="0" distL="0" distR="0">
+            <wp:extent cx="5760720" cy="2180844"/>
+            <wp:effectExtent t="0" r="0" b="0" l="0"/>
+            <wp:docPr id="3" name="" descr="" title=""/>
+            <wp:cNvGraphicFramePr>
+              <a:graphicFrameLocks xmlns:a="http://schemas.openxmlformats.org/drawingml/2006/main" noChangeAspect="1"/>
+            </wp:cNvGraphicFramePr>
+            <a:graphic xmlns:a="http://schemas.openxmlformats.org/drawingml/2006/main">
+              <a:graphicData uri="http://schemas.openxmlformats.org/drawingml/2006/picture">
+                <pic:pic xmlns:pic="http://schemas.openxmlformats.org/drawingml/2006/picture">
+                  <pic:nvPicPr>
+                    <pic:cNvPr id="0" name="" descr=""/>
+                    <pic:cNvPicPr>
+                      <a:picLocks noChangeAspect="1" noChangeArrowheads="1"/>
+                    </pic:cNvPicPr>
+                  </pic:nvPicPr>
+                  <pic:blipFill>
+                    <a:blip r:embed="rId12" cstate="none"/>
+                    <a:srcRect/>
+                    <a:stretch>
+                      <a:fillRect/>
+                    </a:stretch>
+                  </pic:blipFill>
+                  <pic:spPr bwMode="auto">
+                    <a:xfrm>
+                      <a:off x="0" y="0"/>
+                      <a:ext cx="5760720" cy="2180844"/>
+                    </a:xfrm>
+                    <a:prstGeom prst="rect">
+                      <a:avLst/>
+                    </a:prstGeom>
+                  </pic:spPr>
+                </pic:pic>
+              </a:graphicData>
+            </a:graphic>
+          </wp:inline>
+        </w:drawing>
+      </w:r>
+    </w:p>
+    <w:p>
+      <w:pPr>
+        <w:jc w:val="center"/>
+        <w:spacing w:after="200"/>
+      </w:pPr>
+      <w:r>
+        <w:rPr>
+          <w:rFonts w:ascii="Calibri" w:cs="Calibri" w:eastAsia="Calibri" w:hAnsi="Calibri"/>
+          <w:i/>
+          <w:iCs/>
+          <w:sz w:val="20"/>
+          <w:szCs w:val="20"/>
+          <w:color w:val="595959"/>
+        </w:rPr>
+        <w:t xml:space="preserve">Figure 3. AgentShield dashboard — action feed, with denied actions highlighted; approved actions (e.g. rows 22 and 42, api.weather.com) shown for comparison.</w:t>
       </w:r>
     </w:p>
     <w:p>

</xml_diff>